<commit_message>
Ethical reflection and solutions key points
</commit_message>
<xml_diff>
--- a/Ethical Reflection and improvement.docx
+++ b/Ethical Reflection and improvement.docx
@@ -6,66 +6,63 @@
       <w:pPr>
         <w:rPr>
           <w:rFonts w:ascii="Times New Roman" w:hAnsi="Times New Roman"/>
+          <w:b/>
+          <w:bCs/>
+          <w:sz w:val="32"/>
+          <w:szCs w:val="32"/>
           <w:lang w:val="en-US"/>
         </w:rPr>
       </w:pPr>
       <w:r>
         <w:rPr>
           <w:rFonts w:ascii="Times New Roman" w:hAnsi="Times New Roman"/>
+          <w:b/>
+          <w:bCs/>
+          <w:sz w:val="32"/>
+          <w:szCs w:val="32"/>
           <w:lang w:val="en-US"/>
         </w:rPr>
-        <w:t xml:space="preserve">Key points </w:t>
-      </w:r>
-      <w:r>
-        <w:rPr>
-          <w:rFonts w:ascii="Times New Roman" w:hAnsi="Times New Roman"/>
+        <w:t>E</w:t>
+      </w:r>
+      <w:r>
+        <w:rPr>
+          <w:rFonts w:ascii="Times New Roman" w:hAnsi="Times New Roman"/>
+          <w:b/>
+          <w:bCs/>
+          <w:sz w:val="32"/>
+          <w:szCs w:val="32"/>
           <w:lang w:val="en-US"/>
         </w:rPr>
-        <w:t xml:space="preserve">for ethical reflection and their </w:t>
-      </w:r>
-      <w:r>
-        <w:rPr>
-          <w:rFonts w:ascii="Times New Roman" w:hAnsi="Times New Roman"/>
-          <w:lang w:val="en-US"/>
-        </w:rPr>
-        <w:t>solutions:</w:t>
+        <w:t xml:space="preserve">thical Reflection and improvement </w:t>
       </w:r>
     </w:p>
     <w:p>
       <w:pPr>
         <w:rPr>
           <w:rFonts w:ascii="Times New Roman" w:hAnsi="Times New Roman"/>
-        </w:rPr>
-      </w:pPr>
-      <w:r>
-        <w:rPr>
-          <w:rFonts w:ascii="Times New Roman" w:hAnsi="Times New Roman"/>
-        </w:rPr>
-        <w:t>1.</w:t>
-      </w:r>
-      <w:r>
-        <w:rPr>
-          <w:rFonts w:ascii="Times New Roman" w:hAnsi="Times New Roman"/>
-        </w:rPr>
-        <w:t xml:space="preserve"> </w:t>
-      </w:r>
-      <w:r>
-        <w:rPr>
-          <w:rFonts w:ascii="Times New Roman" w:hAnsi="Times New Roman"/>
-        </w:rPr>
-        <w:t xml:space="preserve">Loot </w:t>
-      </w:r>
-      <w:r>
-        <w:rPr>
-          <w:rFonts w:ascii="Times New Roman" w:hAnsi="Times New Roman"/>
-        </w:rPr>
-        <w:t>boxes (</w:t>
-      </w:r>
-      <w:r>
-        <w:rPr>
-          <w:rFonts w:ascii="Times New Roman" w:hAnsi="Times New Roman"/>
-        </w:rPr>
-        <w:t>mystery rewards). These are paid mystery rewards, a bit like a slot machine. They can push people, especially children, to overspend or develop gambling habits.</w:t>
+          <w:lang w:val="en-US"/>
+        </w:rPr>
+      </w:pPr>
+      <w:r>
+        <w:rPr>
+          <w:rFonts w:ascii="Times New Roman" w:hAnsi="Times New Roman"/>
+          <w:lang w:val="en-US"/>
+        </w:rPr>
+        <w:t xml:space="preserve">Key points </w:t>
+      </w:r>
+      <w:r>
+        <w:rPr>
+          <w:rFonts w:ascii="Times New Roman" w:hAnsi="Times New Roman"/>
+          <w:lang w:val="en-US"/>
+        </w:rPr>
+        <w:t xml:space="preserve">for ethical reflection and their </w:t>
+      </w:r>
+      <w:r>
+        <w:rPr>
+          <w:rFonts w:ascii="Times New Roman" w:hAnsi="Times New Roman"/>
+          <w:lang w:val="en-US"/>
+        </w:rPr>
+        <w:t>solutions:</w:t>
       </w:r>
     </w:p>
     <w:p>
@@ -78,19 +75,31 @@
         <w:rPr>
           <w:rFonts w:ascii="Times New Roman" w:hAnsi="Times New Roman"/>
         </w:rPr>
-        <w:t xml:space="preserve">Solution: show the odds and the real value of the digital product, </w:t>
-      </w:r>
-      <w:r>
-        <w:rPr>
-          <w:rFonts w:ascii="Times New Roman" w:hAnsi="Times New Roman"/>
-        </w:rPr>
-        <w:t>turning</w:t>
-      </w:r>
-      <w:r>
-        <w:rPr>
-          <w:rFonts w:ascii="Times New Roman" w:hAnsi="Times New Roman"/>
-        </w:rPr>
-        <w:t xml:space="preserve"> on spending limits for under-18s by default, and have independent checks.</w:t>
+        <w:t>1.</w:t>
+      </w:r>
+      <w:r>
+        <w:rPr>
+          <w:rFonts w:ascii="Times New Roman" w:hAnsi="Times New Roman"/>
+        </w:rPr>
+        <w:t xml:space="preserve"> </w:t>
+      </w:r>
+      <w:r>
+        <w:rPr>
+          <w:rFonts w:ascii="Times New Roman" w:hAnsi="Times New Roman"/>
+        </w:rPr>
+        <w:t xml:space="preserve">Loot </w:t>
+      </w:r>
+      <w:r>
+        <w:rPr>
+          <w:rFonts w:ascii="Times New Roman" w:hAnsi="Times New Roman"/>
+        </w:rPr>
+        <w:t>boxes (</w:t>
+      </w:r>
+      <w:r>
+        <w:rPr>
+          <w:rFonts w:ascii="Times New Roman" w:hAnsi="Times New Roman"/>
+        </w:rPr>
+        <w:t>mystery rewards). These are paid mystery rewards, a bit like a slot machine. They can push people, especially children, to overspend or develop gambling habits.</w:t>
       </w:r>
     </w:p>
     <w:p>
@@ -103,37 +112,19 @@
         <w:rPr>
           <w:rFonts w:ascii="Times New Roman" w:hAnsi="Times New Roman"/>
         </w:rPr>
-        <w:t xml:space="preserve">2. </w:t>
-      </w:r>
-      <w:r>
-        <w:rPr>
-          <w:rFonts w:ascii="Times New Roman" w:hAnsi="Times New Roman"/>
-        </w:rPr>
-        <w:t xml:space="preserve">Children’s data and platform </w:t>
-      </w:r>
-      <w:r>
-        <w:rPr>
-          <w:rFonts w:ascii="Times New Roman" w:hAnsi="Times New Roman"/>
-        </w:rPr>
-        <w:t>control (</w:t>
-      </w:r>
-      <w:r>
-        <w:rPr>
-          <w:rFonts w:ascii="Times New Roman" w:hAnsi="Times New Roman"/>
-        </w:rPr>
-        <w:t>name,</w:t>
-      </w:r>
-      <w:r>
-        <w:rPr>
-          <w:rFonts w:ascii="Times New Roman" w:hAnsi="Times New Roman"/>
-        </w:rPr>
-        <w:t xml:space="preserve"> address, Ip-address. Card details </w:t>
-      </w:r>
-      <w:r>
-        <w:rPr>
-          <w:rFonts w:ascii="Times New Roman" w:hAnsi="Times New Roman"/>
-        </w:rPr>
-        <w:t>). Platforms collect a lot of information about players, and age checks are weak. Platform owners also set the rules and take a cut of every developer’s sales.</w:t>
+        <w:t xml:space="preserve">Solution: show the odds and the real value of the digital product, </w:t>
+      </w:r>
+      <w:r>
+        <w:rPr>
+          <w:rFonts w:ascii="Times New Roman" w:hAnsi="Times New Roman"/>
+        </w:rPr>
+        <w:t>turning</w:t>
+      </w:r>
+      <w:r>
+        <w:rPr>
+          <w:rFonts w:ascii="Times New Roman" w:hAnsi="Times New Roman"/>
+        </w:rPr>
+        <w:t xml:space="preserve"> on spending limits for under-18s by default, and have independent checks.</w:t>
       </w:r>
     </w:p>
     <w:p>
@@ -146,7 +137,65 @@
         <w:rPr>
           <w:rFonts w:ascii="Times New Roman" w:hAnsi="Times New Roman"/>
         </w:rPr>
-        <w:t>Solution : collect less data, check ages properly, and publish the rules and fees clearly.</w:t>
+        <w:t xml:space="preserve">2. </w:t>
+      </w:r>
+      <w:r>
+        <w:rPr>
+          <w:rFonts w:ascii="Times New Roman" w:hAnsi="Times New Roman"/>
+        </w:rPr>
+        <w:t xml:space="preserve">Children’s data and platform </w:t>
+      </w:r>
+      <w:r>
+        <w:rPr>
+          <w:rFonts w:ascii="Times New Roman" w:hAnsi="Times New Roman"/>
+        </w:rPr>
+        <w:t>control (</w:t>
+      </w:r>
+      <w:r>
+        <w:rPr>
+          <w:rFonts w:ascii="Times New Roman" w:hAnsi="Times New Roman"/>
+        </w:rPr>
+        <w:t>name,</w:t>
+      </w:r>
+      <w:r>
+        <w:rPr>
+          <w:rFonts w:ascii="Times New Roman" w:hAnsi="Times New Roman"/>
+        </w:rPr>
+        <w:t xml:space="preserve"> address, Ip-address. Card </w:t>
+      </w:r>
+      <w:proofErr w:type="gramStart"/>
+      <w:r>
+        <w:rPr>
+          <w:rFonts w:ascii="Times New Roman" w:hAnsi="Times New Roman"/>
+        </w:rPr>
+        <w:t xml:space="preserve">details </w:t>
+      </w:r>
+      <w:r>
+        <w:rPr>
+          <w:rFonts w:ascii="Times New Roman" w:hAnsi="Times New Roman"/>
+        </w:rPr>
+        <w:t>)</w:t>
+      </w:r>
+      <w:proofErr w:type="gramEnd"/>
+      <w:r>
+        <w:rPr>
+          <w:rFonts w:ascii="Times New Roman" w:hAnsi="Times New Roman"/>
+        </w:rPr>
+        <w:t xml:space="preserve">. Platforms collect a lot of information about players, and age checks are weak. Platform owners also set the rules and take a cut of every developer’s </w:t>
+      </w:r>
+      <w:proofErr w:type="gramStart"/>
+      <w:r>
+        <w:rPr>
+          <w:rFonts w:ascii="Times New Roman" w:hAnsi="Times New Roman"/>
+        </w:rPr>
+        <w:t>sales</w:t>
+      </w:r>
+      <w:proofErr w:type="gramEnd"/>
+      <w:r>
+        <w:rPr>
+          <w:rFonts w:ascii="Times New Roman" w:hAnsi="Times New Roman"/>
+        </w:rPr>
+        <w:t>.</w:t>
       </w:r>
     </w:p>
     <w:p>
@@ -155,17 +204,19 @@
           <w:rFonts w:ascii="Times New Roman" w:hAnsi="Times New Roman"/>
         </w:rPr>
       </w:pPr>
-      <w:r>
-        <w:rPr>
-          <w:rFonts w:ascii="Times New Roman" w:hAnsi="Times New Roman"/>
-        </w:rPr>
-        <w:t xml:space="preserve">3. </w:t>
-      </w:r>
-      <w:r>
-        <w:rPr>
-          <w:rFonts w:ascii="Times New Roman" w:hAnsi="Times New Roman"/>
-        </w:rPr>
-        <w:t>Owning games. When you buy a digital game, you usually only buy permission to play it. If the company removes the game or turns off its servers, the game is lose it.</w:t>
+      <w:proofErr w:type="gramStart"/>
+      <w:r>
+        <w:rPr>
+          <w:rFonts w:ascii="Times New Roman" w:hAnsi="Times New Roman"/>
+        </w:rPr>
+        <w:t>Solution :</w:t>
+      </w:r>
+      <w:proofErr w:type="gramEnd"/>
+      <w:r>
+        <w:rPr>
+          <w:rFonts w:ascii="Times New Roman" w:hAnsi="Times New Roman"/>
+        </w:rPr>
+        <w:t xml:space="preserve"> collect less data, check ages properly, and publish the rules and fees clearly.</w:t>
       </w:r>
     </w:p>
     <w:p>
@@ -178,7 +229,27 @@
         <w:rPr>
           <w:rFonts w:ascii="Times New Roman" w:hAnsi="Times New Roman"/>
         </w:rPr>
-        <w:t>Solution : tell buyers if a game needs servers and for how long will the game be accessible, let it work offline when servers close, and let libraries keep old games.</w:t>
+        <w:t xml:space="preserve">3. </w:t>
+      </w:r>
+      <w:r>
+        <w:rPr>
+          <w:rFonts w:ascii="Times New Roman" w:hAnsi="Times New Roman"/>
+        </w:rPr>
+        <w:t xml:space="preserve">Owning games. When you buy a digital game, you usually only buy permission to play it. If the company removes the game or turns off its servers, the game is </w:t>
+      </w:r>
+      <w:proofErr w:type="gramStart"/>
+      <w:r>
+        <w:rPr>
+          <w:rFonts w:ascii="Times New Roman" w:hAnsi="Times New Roman"/>
+        </w:rPr>
+        <w:t>lose</w:t>
+      </w:r>
+      <w:proofErr w:type="gramEnd"/>
+      <w:r>
+        <w:rPr>
+          <w:rFonts w:ascii="Times New Roman" w:hAnsi="Times New Roman"/>
+        </w:rPr>
+        <w:t xml:space="preserve"> it.</w:t>
       </w:r>
     </w:p>
     <w:p>
@@ -187,17 +258,19 @@
           <w:rFonts w:ascii="Times New Roman" w:hAnsi="Times New Roman"/>
         </w:rPr>
       </w:pPr>
-      <w:r>
-        <w:rPr>
-          <w:rFonts w:ascii="Times New Roman" w:hAnsi="Times New Roman"/>
-        </w:rPr>
-        <w:t xml:space="preserve">4. </w:t>
-      </w:r>
-      <w:r>
-        <w:rPr>
-          <w:rFonts w:ascii="Times New Roman" w:hAnsi="Times New Roman"/>
-        </w:rPr>
-        <w:t>Fairness to developers. In 2025 the industry earned record money, but many studios still laid off staff or closed.</w:t>
+      <w:proofErr w:type="gramStart"/>
+      <w:r>
+        <w:rPr>
+          <w:rFonts w:ascii="Times New Roman" w:hAnsi="Times New Roman"/>
+        </w:rPr>
+        <w:t>Solution :</w:t>
+      </w:r>
+      <w:proofErr w:type="gramEnd"/>
+      <w:r>
+        <w:rPr>
+          <w:rFonts w:ascii="Times New Roman" w:hAnsi="Times New Roman"/>
+        </w:rPr>
+        <w:t xml:space="preserve"> tell buyers if a game needs servers and for how long will the game be accessible, let it work offline when servers close, and let libraries keep old games.</w:t>
       </w:r>
     </w:p>
     <w:p>
@@ -210,7 +283,13 @@
         <w:rPr>
           <w:rFonts w:ascii="Times New Roman" w:hAnsi="Times New Roman"/>
         </w:rPr>
-        <w:t>Solution : set realistic deadlines and funding, and make hardware last longer.</w:t>
+        <w:t xml:space="preserve">4. </w:t>
+      </w:r>
+      <w:r>
+        <w:rPr>
+          <w:rFonts w:ascii="Times New Roman" w:hAnsi="Times New Roman"/>
+        </w:rPr>
+        <w:t>Fairness to developers. In 2025 the industry earned record money, but many studios still laid off staff or closed.</w:t>
       </w:r>
     </w:p>
     <w:p>
@@ -219,65 +298,33 @@
           <w:rFonts w:ascii="Times New Roman" w:hAnsi="Times New Roman"/>
         </w:rPr>
       </w:pPr>
-      <w:r>
-        <w:rPr>
-          <w:rFonts w:ascii="Times New Roman" w:hAnsi="Times New Roman" w:cs="Segoe UI Symbol"/>
-        </w:rPr>
-        <w:t xml:space="preserve">5. </w:t>
-      </w:r>
-      <w:r>
-        <w:rPr>
-          <w:rFonts w:ascii="Times New Roman" w:hAnsi="Times New Roman"/>
-        </w:rPr>
-        <w:t xml:space="preserve"> </w:t>
-      </w:r>
-      <w:r>
-        <w:rPr>
-          <w:rFonts w:ascii="Times New Roman" w:hAnsi="Times New Roman" w:cs="Segoe UI Symbol"/>
-        </w:rPr>
-        <w:t>⁠</w:t>
-      </w:r>
-      <w:r>
-        <w:rPr>
-          <w:rFonts w:ascii="Times New Roman" w:hAnsi="Times New Roman"/>
-        </w:rPr>
-        <w:t xml:space="preserve">Addictive design. Daily rewards, streaks, limited-time offers and </w:t>
-      </w:r>
-      <w:r>
-        <w:rPr>
-          <w:rFonts w:ascii="Times New Roman" w:hAnsi="Times New Roman" w:cs="Aptos"/>
-        </w:rPr>
-        <w:t>“</w:t>
-      </w:r>
-      <w:r>
-        <w:rPr>
-          <w:rFonts w:ascii="Times New Roman" w:hAnsi="Times New Roman"/>
-        </w:rPr>
-        <w:t>fear of missing out</w:t>
-      </w:r>
-      <w:r>
-        <w:rPr>
-          <w:rFonts w:ascii="Times New Roman" w:hAnsi="Times New Roman" w:cs="Aptos"/>
-        </w:rPr>
-        <w:t>”</w:t>
-      </w:r>
-      <w:r>
-        <w:rPr>
-          <w:rFonts w:ascii="Times New Roman" w:hAnsi="Times New Roman"/>
-        </w:rPr>
-        <w:t xml:space="preserve"> are built to keep people playing. different from loot boxes, because it</w:t>
-      </w:r>
-      <w:r>
-        <w:rPr>
-          <w:rFonts w:ascii="Times New Roman" w:hAnsi="Times New Roman" w:cs="Aptos"/>
-        </w:rPr>
-        <w:t>’</w:t>
-      </w:r>
-      <w:r>
-        <w:rPr>
-          <w:rFonts w:ascii="Times New Roman" w:hAnsi="Times New Roman"/>
-        </w:rPr>
-        <w:t>s about time as well as money.</w:t>
+      <w:proofErr w:type="gramStart"/>
+      <w:r>
+        <w:rPr>
+          <w:rFonts w:ascii="Times New Roman" w:hAnsi="Times New Roman"/>
+        </w:rPr>
+        <w:t>Solution :</w:t>
+      </w:r>
+      <w:proofErr w:type="gramEnd"/>
+      <w:r>
+        <w:rPr>
+          <w:rFonts w:ascii="Times New Roman" w:hAnsi="Times New Roman"/>
+        </w:rPr>
+        <w:t xml:space="preserve"> set realistic deadlines and </w:t>
+      </w:r>
+      <w:proofErr w:type="gramStart"/>
+      <w:r>
+        <w:rPr>
+          <w:rFonts w:ascii="Times New Roman" w:hAnsi="Times New Roman"/>
+        </w:rPr>
+        <w:t>funding, and</w:t>
+      </w:r>
+      <w:proofErr w:type="gramEnd"/>
+      <w:r>
+        <w:rPr>
+          <w:rFonts w:ascii="Times New Roman" w:hAnsi="Times New Roman"/>
+        </w:rPr>
+        <w:t xml:space="preserve"> make hardware last longer.</w:t>
       </w:r>
     </w:p>
     <w:p>
@@ -288,9 +335,77 @@
       </w:pPr>
       <w:r>
         <w:rPr>
-          <w:rFonts w:ascii="Times New Roman" w:hAnsi="Times New Roman"/>
-        </w:rPr>
-        <w:t>Solutions: adding breaks, also after breaks always give extra time to catch up, save the progress in background</w:t>
+          <w:rFonts w:ascii="Times New Roman" w:hAnsi="Times New Roman" w:cs="Segoe UI Symbol"/>
+        </w:rPr>
+        <w:t xml:space="preserve">5. </w:t>
+      </w:r>
+      <w:r>
+        <w:rPr>
+          <w:rFonts w:ascii="Times New Roman" w:hAnsi="Times New Roman"/>
+        </w:rPr>
+        <w:t xml:space="preserve"> </w:t>
+      </w:r>
+      <w:r>
+        <w:rPr>
+          <w:rFonts w:ascii="Times New Roman" w:hAnsi="Times New Roman" w:cs="Segoe UI Symbol"/>
+        </w:rPr>
+        <w:t>⁠</w:t>
+      </w:r>
+      <w:r>
+        <w:rPr>
+          <w:rFonts w:ascii="Times New Roman" w:hAnsi="Times New Roman"/>
+        </w:rPr>
+        <w:t xml:space="preserve">Addictive design. Daily rewards, streaks, </w:t>
+      </w:r>
+      <w:proofErr w:type="gramStart"/>
+      <w:r>
+        <w:rPr>
+          <w:rFonts w:ascii="Times New Roman" w:hAnsi="Times New Roman"/>
+        </w:rPr>
+        <w:t>limited-time</w:t>
+      </w:r>
+      <w:proofErr w:type="gramEnd"/>
+      <w:r>
+        <w:rPr>
+          <w:rFonts w:ascii="Times New Roman" w:hAnsi="Times New Roman"/>
+        </w:rPr>
+        <w:t xml:space="preserve"> offers and </w:t>
+      </w:r>
+      <w:r>
+        <w:rPr>
+          <w:rFonts w:ascii="Times New Roman" w:hAnsi="Times New Roman" w:cs="Aptos"/>
+        </w:rPr>
+        <w:t>“</w:t>
+      </w:r>
+      <w:r>
+        <w:rPr>
+          <w:rFonts w:ascii="Times New Roman" w:hAnsi="Times New Roman"/>
+        </w:rPr>
+        <w:t>fear of missing out</w:t>
+      </w:r>
+      <w:r>
+        <w:rPr>
+          <w:rFonts w:ascii="Times New Roman" w:hAnsi="Times New Roman" w:cs="Aptos"/>
+        </w:rPr>
+        <w:t>”</w:t>
+      </w:r>
+      <w:r>
+        <w:rPr>
+          <w:rFonts w:ascii="Times New Roman" w:hAnsi="Times New Roman"/>
+        </w:rPr>
+        <w:t xml:space="preserve"> are built to keep people playing. different from loot boxes, because it</w:t>
+      </w:r>
+      <w:r>
+        <w:rPr>
+          <w:rFonts w:ascii="Times New Roman" w:hAnsi="Times New Roman" w:cs="Aptos"/>
+        </w:rPr>
+        <w:t>’</w:t>
+      </w:r>
+      <w:r>
+        <w:rPr>
+          <w:rFonts w:ascii="Times New Roman" w:hAnsi="Times New Roman"/>
+        </w:rPr>
+        <w:t>s about time as well as money.</w:t>
       </w:r>
     </w:p>
     <w:p>
@@ -303,19 +418,7 @@
         <w:rPr>
           <w:rFonts w:ascii="Times New Roman" w:hAnsi="Times New Roman"/>
         </w:rPr>
-        <w:t>6</w:t>
-      </w:r>
-      <w:r>
-        <w:rPr>
-          <w:rFonts w:ascii="Times New Roman" w:hAnsi="Times New Roman"/>
-        </w:rPr>
-        <w:t>.</w:t>
-      </w:r>
-      <w:r>
-        <w:rPr>
-          <w:rFonts w:ascii="Times New Roman" w:hAnsi="Times New Roman"/>
-        </w:rPr>
-        <w:t>⁠ ⁠Online toxicity and safety. Harassment, hate speech and grooming risks in voice and text chat.</w:t>
+        <w:t>Solutions: adding breaks, also after breaks always give extra time to catch up, save the progress in background</w:t>
       </w:r>
     </w:p>
     <w:p>
@@ -328,7 +431,19 @@
         <w:rPr>
           <w:rFonts w:ascii="Times New Roman" w:hAnsi="Times New Roman"/>
         </w:rPr>
-        <w:t>Solution: better reporting tools, moderation, and chat limits for children.</w:t>
+        <w:t>6</w:t>
+      </w:r>
+      <w:r>
+        <w:rPr>
+          <w:rFonts w:ascii="Times New Roman" w:hAnsi="Times New Roman"/>
+        </w:rPr>
+        <w:t>.</w:t>
+      </w:r>
+      <w:r>
+        <w:rPr>
+          <w:rFonts w:ascii="Times New Roman" w:hAnsi="Times New Roman"/>
+        </w:rPr>
+        <w:t>⁠ ⁠Online toxicity and safety. Harassment, hate speech and grooming risks in voice and text chat.</w:t>
       </w:r>
     </w:p>
     <w:p>
@@ -341,13 +456,7 @@
         <w:rPr>
           <w:rFonts w:ascii="Times New Roman" w:hAnsi="Times New Roman"/>
         </w:rPr>
-        <w:t xml:space="preserve">7. </w:t>
-      </w:r>
-      <w:r>
-        <w:rPr>
-          <w:rFonts w:ascii="Times New Roman" w:hAnsi="Times New Roman"/>
-        </w:rPr>
-        <w:t>⁠ ⁠Pay-to-win. Players who spend more get an unfair advantage, which makes games less fair and pushes people to spend.</w:t>
+        <w:t>Solution: better reporting tools, moderation, and chat limits for children.</w:t>
       </w:r>
     </w:p>
     <w:p>
@@ -360,13 +469,46 @@
         <w:rPr>
           <w:rFonts w:ascii="Times New Roman" w:hAnsi="Times New Roman"/>
         </w:rPr>
+        <w:t xml:space="preserve">7. </w:t>
+      </w:r>
+      <w:r>
+        <w:rPr>
+          <w:rFonts w:ascii="Times New Roman" w:hAnsi="Times New Roman"/>
+        </w:rPr>
+        <w:t>⁠ ⁠Pay-to-win. Players who spend more get an unfair advantage, which makes games less fair and pushes people to spend.</w:t>
+      </w:r>
+    </w:p>
+    <w:p>
+      <w:pPr>
+        <w:rPr>
+          <w:rFonts w:ascii="Times New Roman" w:hAnsi="Times New Roman"/>
+        </w:rPr>
+      </w:pPr>
+      <w:r>
+        <w:rPr>
+          <w:rFonts w:ascii="Times New Roman" w:hAnsi="Times New Roman"/>
+        </w:rPr>
         <w:t>Solutions: creating a balance for in game activities</w:t>
       </w:r>
       <w:r>
         <w:rPr>
           <w:rFonts w:ascii="Times New Roman" w:hAnsi="Times New Roman"/>
         </w:rPr>
-        <w:t xml:space="preserve"> and also give a fair advantage to </w:t>
+        <w:t xml:space="preserve"> </w:t>
+      </w:r>
+      <w:proofErr w:type="gramStart"/>
+      <w:r>
+        <w:rPr>
+          <w:rFonts w:ascii="Times New Roman" w:hAnsi="Times New Roman"/>
+        </w:rPr>
+        <w:t>and also</w:t>
+      </w:r>
+      <w:proofErr w:type="gramEnd"/>
+      <w:r>
+        <w:rPr>
+          <w:rFonts w:ascii="Times New Roman" w:hAnsi="Times New Roman"/>
+        </w:rPr>
+        <w:t xml:space="preserve"> give a fair advantage to </w:t>
       </w:r>
       <w:r>
         <w:rPr>
@@ -2407,6 +2549,7 @@
   <w:style w:type="character" w:default="1" w:styleId="DefaultParagraphFont">
     <w:name w:val="Default Paragraph Font"/>
     <w:uiPriority w:val="1"/>
+    <w:semiHidden/>
     <w:unhideWhenUsed/>
   </w:style>
   <w:style w:type="table" w:default="1" w:styleId="TableNormal">

</xml_diff>